<commit_message>
Voice and fixed Load and Save and only problem now is adding BGM
</commit_message>
<xml_diff>
--- a/Documentation/Dere_Character_Sheets.docx
+++ b/Documentation/Dere_Character_Sheets.docx
@@ -23,8 +23,9 @@
             <w:tcW w:w="9456" w:type="dxa"/>
             <w:gridSpan w:val="2"/>
             <w:tcBorders>
-              <w:left w:val="single" w:sz="4" w:space="0" w:color="auto"/>
+              <w:left w:val="single" w:color="auto" w:sz="4" w:space="0"/>
             </w:tcBorders>
+            <w:tcMar/>
           </w:tcPr>
           <w:p>
             <w:pPr>
@@ -91,8 +92,9 @@
           <w:tcPr>
             <w:tcW w:w="4728" w:type="dxa"/>
             <w:tcBorders>
-              <w:top w:val="single" w:sz="4" w:space="0" w:color="auto"/>
+              <w:top w:val="single" w:color="auto" w:sz="4" w:space="0"/>
             </w:tcBorders>
+            <w:tcMar/>
           </w:tcPr>
           <w:p>
             <w:pPr>
@@ -114,6 +116,7 @@
         <w:tc>
           <w:tcPr>
             <w:tcW w:w="4728" w:type="dxa"/>
+            <w:tcMar/>
           </w:tcPr>
           <w:p>
             <w:pPr>
@@ -140,6 +143,7 @@
         <w:tc>
           <w:tcPr>
             <w:tcW w:w="4728" w:type="dxa"/>
+            <w:tcMar/>
           </w:tcPr>
           <w:p>
             <w:pPr>
@@ -166,6 +170,7 @@
         <w:tc>
           <w:tcPr>
             <w:tcW w:w="4728" w:type="dxa"/>
+            <w:tcMar/>
           </w:tcPr>
           <w:p>
             <w:pPr>
@@ -184,6 +189,7 @@
         <w:tc>
           <w:tcPr>
             <w:tcW w:w="4728" w:type="dxa"/>
+            <w:tcMar/>
           </w:tcPr>
           <w:p>
             <w:pPr>
@@ -210,6 +216,7 @@
         <w:tc>
           <w:tcPr>
             <w:tcW w:w="4728" w:type="dxa"/>
+            <w:tcMar/>
           </w:tcPr>
           <w:p>
             <w:pPr>
@@ -228,27 +235,33 @@
         <w:tc>
           <w:tcPr>
             <w:tcW w:w="4728" w:type="dxa"/>
+            <w:tcMar/>
           </w:tcPr>
           <w:p>
             <w:pPr>
               <w:spacing w:before="62" w:after="62"/>
             </w:pPr>
-            <w:proofErr w:type="spellStart"/>
             <w:r>
               <w:rPr>
-                <w:b/>
-                <w:bCs/>
+                <w:b w:val="1"/>
+                <w:bCs w:val="1"/>
               </w:rPr>
               <w:t>Kuudere</w:t>
             </w:r>
-            <w:proofErr w:type="spellEnd"/>
-            <w:r>
+            <w:r>
+              <w:rPr/>
               <w:t xml:space="preserve"> (</w:t>
             </w:r>
             <w:r>
+              <w:rPr/>
               <w:t>Eri</w:t>
             </w:r>
             <w:r>
+              <w:rPr/>
+              <w:t>ka</w:t>
+            </w:r>
+            <w:r>
+              <w:rPr/>
               <w:t>)</w:t>
             </w:r>
           </w:p>
@@ -256,6 +269,7 @@
         <w:tc>
           <w:tcPr>
             <w:tcW w:w="4728" w:type="dxa"/>
+            <w:tcMar/>
           </w:tcPr>
           <w:p>
             <w:pPr>
@@ -274,6 +288,7 @@
         <w:tc>
           <w:tcPr>
             <w:tcW w:w="4728" w:type="dxa"/>
+            <w:tcMar/>
           </w:tcPr>
           <w:p>
             <w:pPr>
@@ -302,6 +317,7 @@
         <w:tc>
           <w:tcPr>
             <w:tcW w:w="4728" w:type="dxa"/>
+            <w:tcMar/>
           </w:tcPr>
           <w:p>
             <w:pPr>
@@ -320,6 +336,7 @@
         <w:tc>
           <w:tcPr>
             <w:tcW w:w="4728" w:type="dxa"/>
+            <w:tcMar/>
           </w:tcPr>
           <w:p>
             <w:pPr>
@@ -348,6 +365,7 @@
         <w:tc>
           <w:tcPr>
             <w:tcW w:w="4728" w:type="dxa"/>
+            <w:tcMar/>
           </w:tcPr>
           <w:p>
             <w:pPr>
@@ -366,6 +384,7 @@
         <w:tc>
           <w:tcPr>
             <w:tcW w:w="4728" w:type="dxa"/>
+            <w:tcMar/>
           </w:tcPr>
           <w:p>
             <w:pPr>
@@ -394,6 +413,7 @@
         <w:tc>
           <w:tcPr>
             <w:tcW w:w="4728" w:type="dxa"/>
+            <w:tcMar/>
           </w:tcPr>
           <w:p>
             <w:pPr>
@@ -412,6 +432,7 @@
         <w:tc>
           <w:tcPr>
             <w:tcW w:w="4728" w:type="dxa"/>
+            <w:tcMar/>
           </w:tcPr>
           <w:p>
             <w:pPr>
@@ -440,6 +461,7 @@
         <w:tc>
           <w:tcPr>
             <w:tcW w:w="4728" w:type="dxa"/>
+            <w:tcMar/>
           </w:tcPr>
           <w:p>
             <w:pPr>
@@ -458,6 +480,7 @@
         <w:tc>
           <w:tcPr>
             <w:tcW w:w="4728" w:type="dxa"/>
+            <w:tcMar/>
           </w:tcPr>
           <w:p>
             <w:pPr>
@@ -485,6 +508,7 @@
         <w:tc>
           <w:tcPr>
             <w:tcW w:w="4728" w:type="dxa"/>
+            <w:tcMar/>
           </w:tcPr>
           <w:p>
             <w:pPr>
@@ -514,6 +538,7 @@
         <w:tc>
           <w:tcPr>
             <w:tcW w:w="4728" w:type="dxa"/>
+            <w:tcMar/>
           </w:tcPr>
           <w:p>
             <w:pPr>
@@ -547,6 +572,7 @@
         <w:tc>
           <w:tcPr>
             <w:tcW w:w="4728" w:type="dxa"/>
+            <w:tcMar/>
           </w:tcPr>
           <w:p>
             <w:pPr>
@@ -565,6 +591,7 @@
         <w:tc>
           <w:tcPr>
             <w:tcW w:w="4728" w:type="dxa"/>
+            <w:tcMar/>
           </w:tcPr>
           <w:p>
             <w:pPr>
@@ -592,6 +619,7 @@
         <w:tc>
           <w:tcPr>
             <w:tcW w:w="4728" w:type="dxa"/>
+            <w:tcMar/>
           </w:tcPr>
           <w:p>
             <w:pPr>
@@ -610,6 +638,7 @@
         <w:tc>
           <w:tcPr>
             <w:tcW w:w="4728" w:type="dxa"/>
+            <w:tcMar/>
           </w:tcPr>
           <w:p>
             <w:pPr>
@@ -637,6 +666,7 @@
         <w:tc>
           <w:tcPr>
             <w:tcW w:w="4728" w:type="dxa"/>
+            <w:tcMar/>
           </w:tcPr>
           <w:p>
             <w:pPr>
@@ -655,6 +685,7 @@
         <w:tc>
           <w:tcPr>
             <w:tcW w:w="4728" w:type="dxa"/>
+            <w:tcMar/>
           </w:tcPr>
           <w:p>
             <w:pPr>
@@ -682,6 +713,7 @@
         <w:tc>
           <w:tcPr>
             <w:tcW w:w="4728" w:type="dxa"/>
+            <w:tcMar/>
           </w:tcPr>
           <w:p>
             <w:pPr>
@@ -700,6 +732,7 @@
         <w:tc>
           <w:tcPr>
             <w:tcW w:w="4728" w:type="dxa"/>
+            <w:tcMar/>
           </w:tcPr>
           <w:p>
             <w:pPr>
@@ -727,6 +760,7 @@
         <w:tc>
           <w:tcPr>
             <w:tcW w:w="4728" w:type="dxa"/>
+            <w:tcMar/>
           </w:tcPr>
           <w:p>
             <w:pPr>
@@ -745,6 +779,7 @@
         <w:tc>
           <w:tcPr>
             <w:tcW w:w="4728" w:type="dxa"/>
+            <w:tcMar/>
           </w:tcPr>
           <w:p>
             <w:pPr>
@@ -803,6 +838,7 @@
         <w:tc>
           <w:tcPr>
             <w:tcW w:w="4728" w:type="dxa"/>
+            <w:tcMar/>
           </w:tcPr>
           <w:p>
             <w:pPr>
@@ -995,7 +1031,7 @@
       </w:pPr>
       <w:r>
         <w:pict w14:anchorId="0245BD10">
-          <v:rect id="_x0000_i1049" style="width:0;height:1.5pt" o:hralign="center" o:hrstd="t" o:hr="t" fillcolor="#a0a0a0" stroked="f"/>
+          <v:rect id="_x0000_i1049" style="width:0;height:1.5pt" o:hr="t" o:hrstd="t" o:hralign="center" fillcolor="#a0a0a0" stroked="f"/>
         </w:pict>
       </w:r>
     </w:p>
@@ -1121,7 +1157,7 @@
       </w:pPr>
       <w:r>
         <w:pict w14:anchorId="4872CDAD">
-          <v:rect id="_x0000_i1050" style="width:0;height:1.5pt" o:hralign="center" o:hrstd="t" o:hr="t" fillcolor="#a0a0a0" stroked="f"/>
+          <v:rect id="_x0000_i1050" style="width:0;height:1.5pt" o:hr="t" o:hrstd="t" o:hralign="center" fillcolor="#a0a0a0" stroked="f"/>
         </w:pict>
       </w:r>
     </w:p>
@@ -1264,7 +1300,7 @@
       </w:pPr>
       <w:r>
         <w:pict w14:anchorId="77494EE5">
-          <v:rect id="_x0000_i1051" style="width:0;height:1.5pt" o:hralign="center" o:hrstd="t" o:hr="t" fillcolor="#a0a0a0" stroked="f"/>
+          <v:rect id="_x0000_i1051" style="width:0;height:1.5pt" o:hr="t" o:hrstd="t" o:hralign="center" fillcolor="#a0a0a0" stroked="f"/>
         </w:pict>
       </w:r>
     </w:p>
@@ -1406,7 +1442,7 @@
       </w:pPr>
       <w:r>
         <w:pict w14:anchorId="5264B15C">
-          <v:rect id="_x0000_i1052" style="width:0;height:1.5pt" o:hralign="center" o:hrstd="t" o:hr="t" fillcolor="#a0a0a0" stroked="f"/>
+          <v:rect id="_x0000_i1052" style="width:0;height:1.5pt" o:hr="t" o:hrstd="t" o:hralign="center" fillcolor="#a0a0a0" stroked="f"/>
         </w:pict>
       </w:r>
     </w:p>
@@ -1414,30 +1450,42 @@
       <w:pPr>
         <w:spacing w:before="62" w:after="62"/>
         <w:rPr>
-          <w:b/>
-          <w:bCs/>
-        </w:rPr>
-      </w:pPr>
-      <w:r>
-        <w:rPr>
-          <w:b/>
-          <w:bCs/>
-        </w:rPr>
-        <w:t>Eri (</w:t>
-      </w:r>
-      <w:proofErr w:type="spellStart"/>
-      <w:r>
-        <w:rPr>
-          <w:b/>
-          <w:bCs/>
+          <w:b w:val="1"/>
+          <w:bCs w:val="1"/>
+        </w:rPr>
+      </w:pPr>
+      <w:r>
+        <w:rPr>
+          <w:b w:val="1"/>
+          <w:bCs w:val="1"/>
+        </w:rPr>
+        <w:t>Eri</w:t>
+      </w:r>
+      <w:r>
+        <w:rPr>
+          <w:b w:val="1"/>
+          <w:bCs w:val="1"/>
+        </w:rPr>
+        <w:t>ka</w:t>
+      </w:r>
+      <w:r>
+        <w:rPr>
+          <w:b w:val="1"/>
+          <w:bCs w:val="1"/>
+        </w:rPr>
+        <w:t xml:space="preserve"> (</w:t>
+      </w:r>
+      <w:r>
+        <w:rPr>
+          <w:b w:val="1"/>
+          <w:bCs w:val="1"/>
         </w:rPr>
         <w:t>Kuudere</w:t>
       </w:r>
-      <w:proofErr w:type="spellEnd"/>
-      <w:r>
-        <w:rPr>
-          <w:b/>
-          <w:bCs/>
+      <w:r>
+        <w:rPr>
+          <w:b w:val="1"/>
+          <w:bCs w:val="1"/>
         </w:rPr>
         <w:t>)</w:t>
       </w:r>
@@ -1549,7 +1597,7 @@
       <w:footerReference w:type="default" r:id="rId11"/>
       <w:headerReference w:type="first" r:id="rId12"/>
       <w:footerReference w:type="first" r:id="rId13"/>
-      <w:pgSz w:w="12240" w:h="15840"/>
+      <w:pgSz w:w="12240" w:h="15840" w:orient="portrait"/>
       <w:pgMar w:top="1440" w:right="1440" w:bottom="1440" w:left="1440" w:header="720" w:footer="720" w:gutter="0"/>
       <w:cols w:space="720"/>
       <w:docGrid w:linePitch="360"/>
@@ -1700,7 +1748,7 @@
         <w:ind w:left="720" w:hanging="360"/>
       </w:pPr>
       <w:rPr>
-        <w:rFonts w:ascii="Symbol" w:hAnsi="Symbol" w:hint="default"/>
+        <w:rFonts w:hint="default" w:ascii="Symbol" w:hAnsi="Symbol"/>
         <w:sz w:val="20"/>
       </w:rPr>
     </w:lvl>
@@ -1716,7 +1764,7 @@
         <w:ind w:left="1440" w:hanging="360"/>
       </w:pPr>
       <w:rPr>
-        <w:rFonts w:ascii="Courier New" w:hAnsi="Courier New" w:hint="default"/>
+        <w:rFonts w:hint="default" w:ascii="Courier New" w:hAnsi="Courier New"/>
         <w:sz w:val="20"/>
       </w:rPr>
     </w:lvl>
@@ -1732,7 +1780,7 @@
         <w:ind w:left="2160" w:hanging="360"/>
       </w:pPr>
       <w:rPr>
-        <w:rFonts w:ascii="Wingdings" w:hAnsi="Wingdings" w:hint="default"/>
+        <w:rFonts w:hint="default" w:ascii="Wingdings" w:hAnsi="Wingdings"/>
         <w:sz w:val="20"/>
       </w:rPr>
     </w:lvl>
@@ -1748,7 +1796,7 @@
         <w:ind w:left="2880" w:hanging="360"/>
       </w:pPr>
       <w:rPr>
-        <w:rFonts w:ascii="Wingdings" w:hAnsi="Wingdings" w:hint="default"/>
+        <w:rFonts w:hint="default" w:ascii="Wingdings" w:hAnsi="Wingdings"/>
         <w:sz w:val="20"/>
       </w:rPr>
     </w:lvl>
@@ -1764,7 +1812,7 @@
         <w:ind w:left="3600" w:hanging="360"/>
       </w:pPr>
       <w:rPr>
-        <w:rFonts w:ascii="Wingdings" w:hAnsi="Wingdings" w:hint="default"/>
+        <w:rFonts w:hint="default" w:ascii="Wingdings" w:hAnsi="Wingdings"/>
         <w:sz w:val="20"/>
       </w:rPr>
     </w:lvl>
@@ -1780,7 +1828,7 @@
         <w:ind w:left="4320" w:hanging="360"/>
       </w:pPr>
       <w:rPr>
-        <w:rFonts w:ascii="Wingdings" w:hAnsi="Wingdings" w:hint="default"/>
+        <w:rFonts w:hint="default" w:ascii="Wingdings" w:hAnsi="Wingdings"/>
         <w:sz w:val="20"/>
       </w:rPr>
     </w:lvl>
@@ -1796,7 +1844,7 @@
         <w:ind w:left="5040" w:hanging="360"/>
       </w:pPr>
       <w:rPr>
-        <w:rFonts w:ascii="Wingdings" w:hAnsi="Wingdings" w:hint="default"/>
+        <w:rFonts w:hint="default" w:ascii="Wingdings" w:hAnsi="Wingdings"/>
         <w:sz w:val="20"/>
       </w:rPr>
     </w:lvl>
@@ -1812,7 +1860,7 @@
         <w:ind w:left="5760" w:hanging="360"/>
       </w:pPr>
       <w:rPr>
-        <w:rFonts w:ascii="Wingdings" w:hAnsi="Wingdings" w:hint="default"/>
+        <w:rFonts w:hint="default" w:ascii="Wingdings" w:hAnsi="Wingdings"/>
         <w:sz w:val="20"/>
       </w:rPr>
     </w:lvl>
@@ -1828,7 +1876,7 @@
         <w:ind w:left="6480" w:hanging="360"/>
       </w:pPr>
       <w:rPr>
-        <w:rFonts w:ascii="Wingdings" w:hAnsi="Wingdings" w:hint="default"/>
+        <w:rFonts w:hint="default" w:ascii="Wingdings" w:hAnsi="Wingdings"/>
         <w:sz w:val="20"/>
       </w:rPr>
     </w:lvl>
@@ -1849,7 +1897,7 @@
         <w:ind w:left="720" w:hanging="360"/>
       </w:pPr>
       <w:rPr>
-        <w:rFonts w:ascii="Symbol" w:hAnsi="Symbol" w:hint="default"/>
+        <w:rFonts w:hint="default" w:ascii="Symbol" w:hAnsi="Symbol"/>
         <w:sz w:val="20"/>
       </w:rPr>
     </w:lvl>
@@ -1865,7 +1913,7 @@
         <w:ind w:left="1440" w:hanging="360"/>
       </w:pPr>
       <w:rPr>
-        <w:rFonts w:ascii="Courier New" w:hAnsi="Courier New" w:hint="default"/>
+        <w:rFonts w:hint="default" w:ascii="Courier New" w:hAnsi="Courier New"/>
         <w:sz w:val="20"/>
       </w:rPr>
     </w:lvl>
@@ -1881,7 +1929,7 @@
         <w:ind w:left="2160" w:hanging="360"/>
       </w:pPr>
       <w:rPr>
-        <w:rFonts w:ascii="Wingdings" w:hAnsi="Wingdings" w:hint="default"/>
+        <w:rFonts w:hint="default" w:ascii="Wingdings" w:hAnsi="Wingdings"/>
         <w:sz w:val="20"/>
       </w:rPr>
     </w:lvl>
@@ -1897,7 +1945,7 @@
         <w:ind w:left="2880" w:hanging="360"/>
       </w:pPr>
       <w:rPr>
-        <w:rFonts w:ascii="Wingdings" w:hAnsi="Wingdings" w:hint="default"/>
+        <w:rFonts w:hint="default" w:ascii="Wingdings" w:hAnsi="Wingdings"/>
         <w:sz w:val="20"/>
       </w:rPr>
     </w:lvl>
@@ -1913,7 +1961,7 @@
         <w:ind w:left="3600" w:hanging="360"/>
       </w:pPr>
       <w:rPr>
-        <w:rFonts w:ascii="Wingdings" w:hAnsi="Wingdings" w:hint="default"/>
+        <w:rFonts w:hint="default" w:ascii="Wingdings" w:hAnsi="Wingdings"/>
         <w:sz w:val="20"/>
       </w:rPr>
     </w:lvl>
@@ -1929,7 +1977,7 @@
         <w:ind w:left="4320" w:hanging="360"/>
       </w:pPr>
       <w:rPr>
-        <w:rFonts w:ascii="Wingdings" w:hAnsi="Wingdings" w:hint="default"/>
+        <w:rFonts w:hint="default" w:ascii="Wingdings" w:hAnsi="Wingdings"/>
         <w:sz w:val="20"/>
       </w:rPr>
     </w:lvl>
@@ -1945,7 +1993,7 @@
         <w:ind w:left="5040" w:hanging="360"/>
       </w:pPr>
       <w:rPr>
-        <w:rFonts w:ascii="Wingdings" w:hAnsi="Wingdings" w:hint="default"/>
+        <w:rFonts w:hint="default" w:ascii="Wingdings" w:hAnsi="Wingdings"/>
         <w:sz w:val="20"/>
       </w:rPr>
     </w:lvl>
@@ -1961,7 +2009,7 @@
         <w:ind w:left="5760" w:hanging="360"/>
       </w:pPr>
       <w:rPr>
-        <w:rFonts w:ascii="Wingdings" w:hAnsi="Wingdings" w:hint="default"/>
+        <w:rFonts w:hint="default" w:ascii="Wingdings" w:hAnsi="Wingdings"/>
         <w:sz w:val="20"/>
       </w:rPr>
     </w:lvl>
@@ -1977,7 +2025,7 @@
         <w:ind w:left="6480" w:hanging="360"/>
       </w:pPr>
       <w:rPr>
-        <w:rFonts w:ascii="Wingdings" w:hAnsi="Wingdings" w:hint="default"/>
+        <w:rFonts w:hint="default" w:ascii="Wingdings" w:hAnsi="Wingdings"/>
         <w:sz w:val="20"/>
       </w:rPr>
     </w:lvl>
@@ -1998,7 +2046,7 @@
         <w:ind w:left="720" w:hanging="360"/>
       </w:pPr>
       <w:rPr>
-        <w:rFonts w:ascii="Symbol" w:hAnsi="Symbol" w:hint="default"/>
+        <w:rFonts w:hint="default" w:ascii="Symbol" w:hAnsi="Symbol"/>
         <w:sz w:val="20"/>
       </w:rPr>
     </w:lvl>
@@ -2014,7 +2062,7 @@
         <w:ind w:left="1440" w:hanging="360"/>
       </w:pPr>
       <w:rPr>
-        <w:rFonts w:ascii="Courier New" w:hAnsi="Courier New" w:hint="default"/>
+        <w:rFonts w:hint="default" w:ascii="Courier New" w:hAnsi="Courier New"/>
         <w:sz w:val="20"/>
       </w:rPr>
     </w:lvl>
@@ -2030,7 +2078,7 @@
         <w:ind w:left="2160" w:hanging="360"/>
       </w:pPr>
       <w:rPr>
-        <w:rFonts w:ascii="Wingdings" w:hAnsi="Wingdings" w:hint="default"/>
+        <w:rFonts w:hint="default" w:ascii="Wingdings" w:hAnsi="Wingdings"/>
         <w:sz w:val="20"/>
       </w:rPr>
     </w:lvl>
@@ -2046,7 +2094,7 @@
         <w:ind w:left="2880" w:hanging="360"/>
       </w:pPr>
       <w:rPr>
-        <w:rFonts w:ascii="Wingdings" w:hAnsi="Wingdings" w:hint="default"/>
+        <w:rFonts w:hint="default" w:ascii="Wingdings" w:hAnsi="Wingdings"/>
         <w:sz w:val="20"/>
       </w:rPr>
     </w:lvl>
@@ -2062,7 +2110,7 @@
         <w:ind w:left="3600" w:hanging="360"/>
       </w:pPr>
       <w:rPr>
-        <w:rFonts w:ascii="Wingdings" w:hAnsi="Wingdings" w:hint="default"/>
+        <w:rFonts w:hint="default" w:ascii="Wingdings" w:hAnsi="Wingdings"/>
         <w:sz w:val="20"/>
       </w:rPr>
     </w:lvl>
@@ -2078,7 +2126,7 @@
         <w:ind w:left="4320" w:hanging="360"/>
       </w:pPr>
       <w:rPr>
-        <w:rFonts w:ascii="Wingdings" w:hAnsi="Wingdings" w:hint="default"/>
+        <w:rFonts w:hint="default" w:ascii="Wingdings" w:hAnsi="Wingdings"/>
         <w:sz w:val="20"/>
       </w:rPr>
     </w:lvl>
@@ -2094,7 +2142,7 @@
         <w:ind w:left="5040" w:hanging="360"/>
       </w:pPr>
       <w:rPr>
-        <w:rFonts w:ascii="Wingdings" w:hAnsi="Wingdings" w:hint="default"/>
+        <w:rFonts w:hint="default" w:ascii="Wingdings" w:hAnsi="Wingdings"/>
         <w:sz w:val="20"/>
       </w:rPr>
     </w:lvl>
@@ -2110,7 +2158,7 @@
         <w:ind w:left="5760" w:hanging="360"/>
       </w:pPr>
       <w:rPr>
-        <w:rFonts w:ascii="Wingdings" w:hAnsi="Wingdings" w:hint="default"/>
+        <w:rFonts w:hint="default" w:ascii="Wingdings" w:hAnsi="Wingdings"/>
         <w:sz w:val="20"/>
       </w:rPr>
     </w:lvl>
@@ -2126,7 +2174,7 @@
         <w:ind w:left="6480" w:hanging="360"/>
       </w:pPr>
       <w:rPr>
-        <w:rFonts w:ascii="Wingdings" w:hAnsi="Wingdings" w:hint="default"/>
+        <w:rFonts w:hint="default" w:ascii="Wingdings" w:hAnsi="Wingdings"/>
         <w:sz w:val="20"/>
       </w:rPr>
     </w:lvl>
@@ -2147,7 +2195,7 @@
         <w:ind w:left="720" w:hanging="360"/>
       </w:pPr>
       <w:rPr>
-        <w:rFonts w:ascii="Symbol" w:hAnsi="Symbol" w:hint="default"/>
+        <w:rFonts w:hint="default" w:ascii="Symbol" w:hAnsi="Symbol"/>
         <w:sz w:val="20"/>
       </w:rPr>
     </w:lvl>
@@ -2163,7 +2211,7 @@
         <w:ind w:left="1440" w:hanging="360"/>
       </w:pPr>
       <w:rPr>
-        <w:rFonts w:ascii="Courier New" w:hAnsi="Courier New" w:hint="default"/>
+        <w:rFonts w:hint="default" w:ascii="Courier New" w:hAnsi="Courier New"/>
         <w:sz w:val="20"/>
       </w:rPr>
     </w:lvl>
@@ -2179,7 +2227,7 @@
         <w:ind w:left="2160" w:hanging="360"/>
       </w:pPr>
       <w:rPr>
-        <w:rFonts w:ascii="Wingdings" w:hAnsi="Wingdings" w:hint="default"/>
+        <w:rFonts w:hint="default" w:ascii="Wingdings" w:hAnsi="Wingdings"/>
         <w:sz w:val="20"/>
       </w:rPr>
     </w:lvl>
@@ -2195,7 +2243,7 @@
         <w:ind w:left="2880" w:hanging="360"/>
       </w:pPr>
       <w:rPr>
-        <w:rFonts w:ascii="Wingdings" w:hAnsi="Wingdings" w:hint="default"/>
+        <w:rFonts w:hint="default" w:ascii="Wingdings" w:hAnsi="Wingdings"/>
         <w:sz w:val="20"/>
       </w:rPr>
     </w:lvl>
@@ -2211,7 +2259,7 @@
         <w:ind w:left="3600" w:hanging="360"/>
       </w:pPr>
       <w:rPr>
-        <w:rFonts w:ascii="Wingdings" w:hAnsi="Wingdings" w:hint="default"/>
+        <w:rFonts w:hint="default" w:ascii="Wingdings" w:hAnsi="Wingdings"/>
         <w:sz w:val="20"/>
       </w:rPr>
     </w:lvl>
@@ -2227,7 +2275,7 @@
         <w:ind w:left="4320" w:hanging="360"/>
       </w:pPr>
       <w:rPr>
-        <w:rFonts w:ascii="Wingdings" w:hAnsi="Wingdings" w:hint="default"/>
+        <w:rFonts w:hint="default" w:ascii="Wingdings" w:hAnsi="Wingdings"/>
         <w:sz w:val="20"/>
       </w:rPr>
     </w:lvl>
@@ -2243,7 +2291,7 @@
         <w:ind w:left="5040" w:hanging="360"/>
       </w:pPr>
       <w:rPr>
-        <w:rFonts w:ascii="Wingdings" w:hAnsi="Wingdings" w:hint="default"/>
+        <w:rFonts w:hint="default" w:ascii="Wingdings" w:hAnsi="Wingdings"/>
         <w:sz w:val="20"/>
       </w:rPr>
     </w:lvl>
@@ -2259,7 +2307,7 @@
         <w:ind w:left="5760" w:hanging="360"/>
       </w:pPr>
       <w:rPr>
-        <w:rFonts w:ascii="Wingdings" w:hAnsi="Wingdings" w:hint="default"/>
+        <w:rFonts w:hint="default" w:ascii="Wingdings" w:hAnsi="Wingdings"/>
         <w:sz w:val="20"/>
       </w:rPr>
     </w:lvl>
@@ -2275,7 +2323,7 @@
         <w:ind w:left="6480" w:hanging="360"/>
       </w:pPr>
       <w:rPr>
-        <w:rFonts w:ascii="Wingdings" w:hAnsi="Wingdings" w:hint="default"/>
+        <w:rFonts w:hint="default" w:ascii="Wingdings" w:hAnsi="Wingdings"/>
         <w:sz w:val="20"/>
       </w:rPr>
     </w:lvl>
@@ -2296,7 +2344,7 @@
         <w:ind w:left="720" w:hanging="360"/>
       </w:pPr>
       <w:rPr>
-        <w:rFonts w:ascii="Symbol" w:hAnsi="Symbol" w:hint="default"/>
+        <w:rFonts w:hint="default" w:ascii="Symbol" w:hAnsi="Symbol"/>
         <w:sz w:val="20"/>
       </w:rPr>
     </w:lvl>
@@ -2312,7 +2360,7 @@
         <w:ind w:left="1440" w:hanging="360"/>
       </w:pPr>
       <w:rPr>
-        <w:rFonts w:ascii="Courier New" w:hAnsi="Courier New" w:hint="default"/>
+        <w:rFonts w:hint="default" w:ascii="Courier New" w:hAnsi="Courier New"/>
         <w:sz w:val="20"/>
       </w:rPr>
     </w:lvl>
@@ -2328,7 +2376,7 @@
         <w:ind w:left="2160" w:hanging="360"/>
       </w:pPr>
       <w:rPr>
-        <w:rFonts w:ascii="Wingdings" w:hAnsi="Wingdings" w:hint="default"/>
+        <w:rFonts w:hint="default" w:ascii="Wingdings" w:hAnsi="Wingdings"/>
         <w:sz w:val="20"/>
       </w:rPr>
     </w:lvl>
@@ -2344,7 +2392,7 @@
         <w:ind w:left="2880" w:hanging="360"/>
       </w:pPr>
       <w:rPr>
-        <w:rFonts w:ascii="Wingdings" w:hAnsi="Wingdings" w:hint="default"/>
+        <w:rFonts w:hint="default" w:ascii="Wingdings" w:hAnsi="Wingdings"/>
         <w:sz w:val="20"/>
       </w:rPr>
     </w:lvl>
@@ -2360,7 +2408,7 @@
         <w:ind w:left="3600" w:hanging="360"/>
       </w:pPr>
       <w:rPr>
-        <w:rFonts w:ascii="Wingdings" w:hAnsi="Wingdings" w:hint="default"/>
+        <w:rFonts w:hint="default" w:ascii="Wingdings" w:hAnsi="Wingdings"/>
         <w:sz w:val="20"/>
       </w:rPr>
     </w:lvl>
@@ -2376,7 +2424,7 @@
         <w:ind w:left="4320" w:hanging="360"/>
       </w:pPr>
       <w:rPr>
-        <w:rFonts w:ascii="Wingdings" w:hAnsi="Wingdings" w:hint="default"/>
+        <w:rFonts w:hint="default" w:ascii="Wingdings" w:hAnsi="Wingdings"/>
         <w:sz w:val="20"/>
       </w:rPr>
     </w:lvl>
@@ -2392,7 +2440,7 @@
         <w:ind w:left="5040" w:hanging="360"/>
       </w:pPr>
       <w:rPr>
-        <w:rFonts w:ascii="Wingdings" w:hAnsi="Wingdings" w:hint="default"/>
+        <w:rFonts w:hint="default" w:ascii="Wingdings" w:hAnsi="Wingdings"/>
         <w:sz w:val="20"/>
       </w:rPr>
     </w:lvl>
@@ -2408,7 +2456,7 @@
         <w:ind w:left="5760" w:hanging="360"/>
       </w:pPr>
       <w:rPr>
-        <w:rFonts w:ascii="Wingdings" w:hAnsi="Wingdings" w:hint="default"/>
+        <w:rFonts w:hint="default" w:ascii="Wingdings" w:hAnsi="Wingdings"/>
         <w:sz w:val="20"/>
       </w:rPr>
     </w:lvl>
@@ -2424,7 +2472,7 @@
         <w:ind w:left="6480" w:hanging="360"/>
       </w:pPr>
       <w:rPr>
-        <w:rFonts w:ascii="Wingdings" w:hAnsi="Wingdings" w:hint="default"/>
+        <w:rFonts w:hint="default" w:ascii="Wingdings" w:hAnsi="Wingdings"/>
         <w:sz w:val="20"/>
       </w:rPr>
     </w:lvl>
@@ -2452,7 +2500,7 @@
   <w:docDefaults>
     <w:rPrDefault>
       <w:rPr>
-        <w:rFonts w:asciiTheme="minorHAnsi" w:eastAsiaTheme="minorHAnsi" w:hAnsiTheme="minorHAnsi" w:cstheme="minorBidi"/>
+        <w:rFonts w:asciiTheme="minorHAnsi" w:hAnsiTheme="minorHAnsi" w:eastAsiaTheme="minorHAnsi" w:cstheme="minorBidi"/>
         <w:kern w:val="2"/>
         <w:sz w:val="22"/>
         <w:szCs w:val="22"/>
@@ -2462,21 +2510,21 @@
     </w:rPrDefault>
     <w:pPrDefault>
       <w:pPr>
-        <w:spacing w:beforeLines="26" w:before="26" w:afterLines="26" w:after="26" w:line="259" w:lineRule="auto"/>
+        <w:spacing w:before="26" w:beforeLines="26" w:after="26" w:afterLines="26" w:line="259" w:lineRule="auto"/>
       </w:pPr>
     </w:pPrDefault>
   </w:docDefaults>
   <w:latentStyles w:defLockedState="0" w:defUIPriority="99" w:defSemiHidden="0" w:defUnhideWhenUsed="0" w:defQFormat="0" w:count="376">
     <w:lsdException w:name="Normal" w:uiPriority="0" w:qFormat="1"/>
     <w:lsdException w:name="heading 1" w:uiPriority="9" w:qFormat="1"/>
-    <w:lsdException w:name="heading 2" w:semiHidden="1" w:uiPriority="9" w:unhideWhenUsed="1" w:qFormat="1"/>
-    <w:lsdException w:name="heading 3" w:semiHidden="1" w:uiPriority="9" w:unhideWhenUsed="1" w:qFormat="1"/>
-    <w:lsdException w:name="heading 4" w:semiHidden="1" w:uiPriority="9" w:unhideWhenUsed="1" w:qFormat="1"/>
-    <w:lsdException w:name="heading 5" w:semiHidden="1" w:uiPriority="9" w:unhideWhenUsed="1" w:qFormat="1"/>
-    <w:lsdException w:name="heading 6" w:semiHidden="1" w:uiPriority="9" w:unhideWhenUsed="1" w:qFormat="1"/>
-    <w:lsdException w:name="heading 7" w:semiHidden="1" w:uiPriority="9" w:unhideWhenUsed="1" w:qFormat="1"/>
-    <w:lsdException w:name="heading 8" w:semiHidden="1" w:uiPriority="9" w:unhideWhenUsed="1" w:qFormat="1"/>
-    <w:lsdException w:name="heading 9" w:semiHidden="1" w:uiPriority="9" w:unhideWhenUsed="1" w:qFormat="1"/>
+    <w:lsdException w:name="heading 2" w:uiPriority="9" w:semiHidden="1" w:unhideWhenUsed="1" w:qFormat="1"/>
+    <w:lsdException w:name="heading 3" w:uiPriority="9" w:semiHidden="1" w:unhideWhenUsed="1" w:qFormat="1"/>
+    <w:lsdException w:name="heading 4" w:uiPriority="9" w:semiHidden="1" w:unhideWhenUsed="1" w:qFormat="1"/>
+    <w:lsdException w:name="heading 5" w:uiPriority="9" w:semiHidden="1" w:unhideWhenUsed="1" w:qFormat="1"/>
+    <w:lsdException w:name="heading 6" w:uiPriority="9" w:semiHidden="1" w:unhideWhenUsed="1" w:qFormat="1"/>
+    <w:lsdException w:name="heading 7" w:uiPriority="9" w:semiHidden="1" w:unhideWhenUsed="1" w:qFormat="1"/>
+    <w:lsdException w:name="heading 8" w:uiPriority="9" w:semiHidden="1" w:unhideWhenUsed="1" w:qFormat="1"/>
+    <w:lsdException w:name="heading 9" w:uiPriority="9" w:semiHidden="1" w:unhideWhenUsed="1" w:qFormat="1"/>
     <w:lsdException w:name="index 1" w:semiHidden="1" w:unhideWhenUsed="1"/>
     <w:lsdException w:name="index 2" w:semiHidden="1" w:unhideWhenUsed="1"/>
     <w:lsdException w:name="index 3" w:semiHidden="1" w:unhideWhenUsed="1"/>
@@ -2486,22 +2534,22 @@
     <w:lsdException w:name="index 7" w:semiHidden="1" w:unhideWhenUsed="1"/>
     <w:lsdException w:name="index 8" w:semiHidden="1" w:unhideWhenUsed="1"/>
     <w:lsdException w:name="index 9" w:semiHidden="1" w:unhideWhenUsed="1"/>
-    <w:lsdException w:name="toc 1" w:semiHidden="1" w:uiPriority="39" w:unhideWhenUsed="1"/>
-    <w:lsdException w:name="toc 2" w:semiHidden="1" w:uiPriority="39" w:unhideWhenUsed="1"/>
-    <w:lsdException w:name="toc 3" w:semiHidden="1" w:uiPriority="39" w:unhideWhenUsed="1"/>
-    <w:lsdException w:name="toc 4" w:semiHidden="1" w:uiPriority="39" w:unhideWhenUsed="1"/>
-    <w:lsdException w:name="toc 5" w:semiHidden="1" w:uiPriority="39" w:unhideWhenUsed="1"/>
-    <w:lsdException w:name="toc 6" w:semiHidden="1" w:uiPriority="39" w:unhideWhenUsed="1"/>
-    <w:lsdException w:name="toc 7" w:semiHidden="1" w:uiPriority="39" w:unhideWhenUsed="1"/>
-    <w:lsdException w:name="toc 8" w:semiHidden="1" w:uiPriority="39" w:unhideWhenUsed="1"/>
-    <w:lsdException w:name="toc 9" w:semiHidden="1" w:uiPriority="39" w:unhideWhenUsed="1"/>
+    <w:lsdException w:name="toc 1" w:uiPriority="39" w:semiHidden="1" w:unhideWhenUsed="1"/>
+    <w:lsdException w:name="toc 2" w:uiPriority="39" w:semiHidden="1" w:unhideWhenUsed="1"/>
+    <w:lsdException w:name="toc 3" w:uiPriority="39" w:semiHidden="1" w:unhideWhenUsed="1"/>
+    <w:lsdException w:name="toc 4" w:uiPriority="39" w:semiHidden="1" w:unhideWhenUsed="1"/>
+    <w:lsdException w:name="toc 5" w:uiPriority="39" w:semiHidden="1" w:unhideWhenUsed="1"/>
+    <w:lsdException w:name="toc 6" w:uiPriority="39" w:semiHidden="1" w:unhideWhenUsed="1"/>
+    <w:lsdException w:name="toc 7" w:uiPriority="39" w:semiHidden="1" w:unhideWhenUsed="1"/>
+    <w:lsdException w:name="toc 8" w:uiPriority="39" w:semiHidden="1" w:unhideWhenUsed="1"/>
+    <w:lsdException w:name="toc 9" w:uiPriority="39" w:semiHidden="1" w:unhideWhenUsed="1"/>
     <w:lsdException w:name="Normal Indent" w:semiHidden="1" w:unhideWhenUsed="1"/>
     <w:lsdException w:name="footnote text" w:semiHidden="1" w:unhideWhenUsed="1"/>
     <w:lsdException w:name="annotation text" w:semiHidden="1" w:unhideWhenUsed="1"/>
     <w:lsdException w:name="header" w:semiHidden="1" w:unhideWhenUsed="1"/>
     <w:lsdException w:name="footer" w:semiHidden="1" w:unhideWhenUsed="1"/>
     <w:lsdException w:name="index heading" w:semiHidden="1" w:unhideWhenUsed="1"/>
-    <w:lsdException w:name="caption" w:semiHidden="1" w:uiPriority="35" w:unhideWhenUsed="1" w:qFormat="1"/>
+    <w:lsdException w:name="caption" w:uiPriority="35" w:semiHidden="1" w:unhideWhenUsed="1" w:qFormat="1"/>
     <w:lsdException w:name="table of figures" w:semiHidden="1" w:unhideWhenUsed="1"/>
     <w:lsdException w:name="envelope address" w:semiHidden="1" w:unhideWhenUsed="1"/>
     <w:lsdException w:name="envelope return" w:semiHidden="1" w:unhideWhenUsed="1"/>
@@ -2532,7 +2580,7 @@
     <w:lsdException w:name="Title" w:uiPriority="10" w:qFormat="1"/>
     <w:lsdException w:name="Closing" w:semiHidden="1" w:unhideWhenUsed="1"/>
     <w:lsdException w:name="Signature" w:semiHidden="1" w:unhideWhenUsed="1"/>
-    <w:lsdException w:name="Default Paragraph Font" w:semiHidden="1" w:uiPriority="1" w:unhideWhenUsed="1"/>
+    <w:lsdException w:name="Default Paragraph Font" w:uiPriority="1" w:semiHidden="1" w:unhideWhenUsed="1"/>
     <w:lsdException w:name="Body Text" w:semiHidden="1" w:unhideWhenUsed="1"/>
     <w:lsdException w:name="Body Text Indent" w:semiHidden="1" w:unhideWhenUsed="1"/>
     <w:lsdException w:name="List Continue" w:semiHidden="1" w:unhideWhenUsed="1"/>
@@ -2732,8 +2780,8 @@
     <w:lsdException w:name="Subtle Reference" w:uiPriority="31" w:qFormat="1"/>
     <w:lsdException w:name="Intense Reference" w:uiPriority="32" w:qFormat="1"/>
     <w:lsdException w:name="Book Title" w:uiPriority="33" w:qFormat="1"/>
-    <w:lsdException w:name="Bibliography" w:semiHidden="1" w:uiPriority="37" w:unhideWhenUsed="1"/>
-    <w:lsdException w:name="TOC Heading" w:semiHidden="1" w:uiPriority="39" w:unhideWhenUsed="1" w:qFormat="1"/>
+    <w:lsdException w:name="Bibliography" w:uiPriority="37" w:semiHidden="1" w:unhideWhenUsed="1"/>
+    <w:lsdException w:name="TOC Heading" w:uiPriority="39" w:semiHidden="1" w:unhideWhenUsed="1" w:qFormat="1"/>
     <w:lsdException w:name="Plain Table 1" w:uiPriority="41"/>
     <w:lsdException w:name="Plain Table 2" w:uiPriority="42"/>
     <w:lsdException w:name="Plain Table 3" w:uiPriority="43"/>
@@ -2844,7 +2892,7 @@
     <w:lsdException w:name="Unresolved Mention" w:semiHidden="1" w:unhideWhenUsed="1"/>
     <w:lsdException w:name="Smart Link" w:semiHidden="1" w:unhideWhenUsed="1"/>
   </w:latentStyles>
-  <w:style w:type="paragraph" w:default="1" w:styleId="Normal">
+  <w:style w:type="paragraph" w:styleId="Normal" w:default="1">
     <w:name w:val="Normal"/>
     <w:qFormat/>
     <w:pPr>
@@ -2866,7 +2914,7 @@
       <w:outlineLvl w:val="0"/>
     </w:pPr>
     <w:rPr>
-      <w:rFonts w:asciiTheme="majorHAnsi" w:eastAsiaTheme="majorEastAsia" w:hAnsiTheme="majorHAnsi" w:cstheme="majorBidi"/>
+      <w:rFonts w:asciiTheme="majorHAnsi" w:hAnsiTheme="majorHAnsi" w:eastAsiaTheme="majorEastAsia" w:cstheme="majorBidi"/>
       <w:color w:val="2F5496" w:themeColor="accent1" w:themeShade="BF"/>
       <w:sz w:val="40"/>
       <w:szCs w:val="40"/>
@@ -2889,7 +2937,7 @@
       <w:outlineLvl w:val="1"/>
     </w:pPr>
     <w:rPr>
-      <w:rFonts w:asciiTheme="majorHAnsi" w:eastAsiaTheme="majorEastAsia" w:hAnsiTheme="majorHAnsi" w:cstheme="majorBidi"/>
+      <w:rFonts w:asciiTheme="majorHAnsi" w:hAnsiTheme="majorHAnsi" w:eastAsiaTheme="majorEastAsia" w:cstheme="majorBidi"/>
       <w:color w:val="2F5496" w:themeColor="accent1" w:themeShade="BF"/>
       <w:sz w:val="32"/>
       <w:szCs w:val="32"/>
@@ -3050,12 +3098,12 @@
       <w:color w:val="272727" w:themeColor="text1" w:themeTint="D8"/>
     </w:rPr>
   </w:style>
-  <w:style w:type="character" w:default="1" w:styleId="DefaultParagraphFont">
+  <w:style w:type="character" w:styleId="DefaultParagraphFont" w:default="1">
     <w:name w:val="Default Paragraph Font"/>
     <w:uiPriority w:val="1"/>
     <w:unhideWhenUsed/>
   </w:style>
-  <w:style w:type="table" w:default="1" w:styleId="TableNormal">
+  <w:style w:type="table" w:styleId="TableNormal" w:default="1">
     <w:name w:val="Normal Table"/>
     <w:uiPriority w:val="99"/>
     <w:semiHidden/>
@@ -3070,26 +3118,26 @@
       </w:tblCellMar>
     </w:tblPr>
   </w:style>
-  <w:style w:type="numbering" w:default="1" w:styleId="NoList">
+  <w:style w:type="numbering" w:styleId="NoList" w:default="1">
     <w:name w:val="No List"/>
     <w:uiPriority w:val="99"/>
     <w:semiHidden/>
     <w:unhideWhenUsed/>
   </w:style>
-  <w:style w:type="character" w:customStyle="1" w:styleId="Heading1Char">
+  <w:style w:type="character" w:styleId="Heading1Char" w:customStyle="1">
     <w:name w:val="Heading 1 Char"/>
     <w:basedOn w:val="DefaultParagraphFont"/>
     <w:link w:val="Heading1"/>
     <w:uiPriority w:val="9"/>
     <w:rsid w:val="000D587D"/>
     <w:rPr>
-      <w:rFonts w:asciiTheme="majorHAnsi" w:eastAsiaTheme="majorEastAsia" w:hAnsiTheme="majorHAnsi" w:cstheme="majorBidi"/>
+      <w:rFonts w:asciiTheme="majorHAnsi" w:hAnsiTheme="majorHAnsi" w:eastAsiaTheme="majorEastAsia" w:cstheme="majorBidi"/>
       <w:color w:val="2F5496" w:themeColor="accent1" w:themeShade="BF"/>
       <w:sz w:val="40"/>
       <w:szCs w:val="40"/>
     </w:rPr>
   </w:style>
-  <w:style w:type="character" w:customStyle="1" w:styleId="Heading2Char">
+  <w:style w:type="character" w:styleId="Heading2Char" w:customStyle="1">
     <w:name w:val="Heading 2 Char"/>
     <w:basedOn w:val="DefaultParagraphFont"/>
     <w:link w:val="Heading2"/>
@@ -3097,13 +3145,13 @@
     <w:semiHidden/>
     <w:rsid w:val="000D587D"/>
     <w:rPr>
-      <w:rFonts w:asciiTheme="majorHAnsi" w:eastAsiaTheme="majorEastAsia" w:hAnsiTheme="majorHAnsi" w:cstheme="majorBidi"/>
+      <w:rFonts w:asciiTheme="majorHAnsi" w:hAnsiTheme="majorHAnsi" w:eastAsiaTheme="majorEastAsia" w:cstheme="majorBidi"/>
       <w:color w:val="2F5496" w:themeColor="accent1" w:themeShade="BF"/>
       <w:sz w:val="32"/>
       <w:szCs w:val="32"/>
     </w:rPr>
   </w:style>
-  <w:style w:type="character" w:customStyle="1" w:styleId="Heading3Char">
+  <w:style w:type="character" w:styleId="Heading3Char" w:customStyle="1">
     <w:name w:val="Heading 3 Char"/>
     <w:basedOn w:val="DefaultParagraphFont"/>
     <w:link w:val="Heading3"/>
@@ -3117,7 +3165,7 @@
       <w:szCs w:val="28"/>
     </w:rPr>
   </w:style>
-  <w:style w:type="character" w:customStyle="1" w:styleId="Heading4Char">
+  <w:style w:type="character" w:styleId="Heading4Char" w:customStyle="1">
     <w:name w:val="Heading 4 Char"/>
     <w:basedOn w:val="DefaultParagraphFont"/>
     <w:link w:val="Heading4"/>
@@ -3131,7 +3179,7 @@
       <w:color w:val="2F5496" w:themeColor="accent1" w:themeShade="BF"/>
     </w:rPr>
   </w:style>
-  <w:style w:type="character" w:customStyle="1" w:styleId="Heading5Char">
+  <w:style w:type="character" w:styleId="Heading5Char" w:customStyle="1">
     <w:name w:val="Heading 5 Char"/>
     <w:basedOn w:val="DefaultParagraphFont"/>
     <w:link w:val="Heading5"/>
@@ -3143,7 +3191,7 @@
       <w:color w:val="2F5496" w:themeColor="accent1" w:themeShade="BF"/>
     </w:rPr>
   </w:style>
-  <w:style w:type="character" w:customStyle="1" w:styleId="Heading6Char">
+  <w:style w:type="character" w:styleId="Heading6Char" w:customStyle="1">
     <w:name w:val="Heading 6 Char"/>
     <w:basedOn w:val="DefaultParagraphFont"/>
     <w:link w:val="Heading6"/>
@@ -3157,7 +3205,7 @@
       <w:color w:val="595959" w:themeColor="text1" w:themeTint="A6"/>
     </w:rPr>
   </w:style>
-  <w:style w:type="character" w:customStyle="1" w:styleId="Heading7Char">
+  <w:style w:type="character" w:styleId="Heading7Char" w:customStyle="1">
     <w:name w:val="Heading 7 Char"/>
     <w:basedOn w:val="DefaultParagraphFont"/>
     <w:link w:val="Heading7"/>
@@ -3169,7 +3217,7 @@
       <w:color w:val="595959" w:themeColor="text1" w:themeTint="A6"/>
     </w:rPr>
   </w:style>
-  <w:style w:type="character" w:customStyle="1" w:styleId="Heading8Char">
+  <w:style w:type="character" w:styleId="Heading8Char" w:customStyle="1">
     <w:name w:val="Heading 8 Char"/>
     <w:basedOn w:val="DefaultParagraphFont"/>
     <w:link w:val="Heading8"/>
@@ -3183,7 +3231,7 @@
       <w:color w:val="272727" w:themeColor="text1" w:themeTint="D8"/>
     </w:rPr>
   </w:style>
-  <w:style w:type="character" w:customStyle="1" w:styleId="Heading9Char">
+  <w:style w:type="character" w:styleId="Heading9Char" w:customStyle="1">
     <w:name w:val="Heading 9 Char"/>
     <w:basedOn w:val="DefaultParagraphFont"/>
     <w:link w:val="Heading9"/>
@@ -3208,21 +3256,21 @@
       <w:contextualSpacing/>
     </w:pPr>
     <w:rPr>
-      <w:rFonts w:asciiTheme="majorHAnsi" w:eastAsiaTheme="majorEastAsia" w:hAnsiTheme="majorHAnsi" w:cstheme="majorBidi"/>
+      <w:rFonts w:asciiTheme="majorHAnsi" w:hAnsiTheme="majorHAnsi" w:eastAsiaTheme="majorEastAsia" w:cstheme="majorBidi"/>
       <w:spacing w:val="-10"/>
       <w:kern w:val="28"/>
       <w:sz w:val="56"/>
       <w:szCs w:val="56"/>
     </w:rPr>
   </w:style>
-  <w:style w:type="character" w:customStyle="1" w:styleId="TitleChar">
+  <w:style w:type="character" w:styleId="TitleChar" w:customStyle="1">
     <w:name w:val="Title Char"/>
     <w:basedOn w:val="DefaultParagraphFont"/>
     <w:link w:val="Title"/>
     <w:uiPriority w:val="10"/>
     <w:rsid w:val="000D587D"/>
     <w:rPr>
-      <w:rFonts w:asciiTheme="majorHAnsi" w:eastAsiaTheme="majorEastAsia" w:hAnsiTheme="majorHAnsi" w:cstheme="majorBidi"/>
+      <w:rFonts w:asciiTheme="majorHAnsi" w:hAnsiTheme="majorHAnsi" w:eastAsiaTheme="majorEastAsia" w:cstheme="majorBidi"/>
       <w:spacing w:val="-10"/>
       <w:kern w:val="28"/>
       <w:sz w:val="56"/>
@@ -3251,7 +3299,7 @@
       <w:szCs w:val="28"/>
     </w:rPr>
   </w:style>
-  <w:style w:type="character" w:customStyle="1" w:styleId="SubtitleChar">
+  <w:style w:type="character" w:styleId="SubtitleChar" w:customStyle="1">
     <w:name w:val="Subtitle Char"/>
     <w:basedOn w:val="DefaultParagraphFont"/>
     <w:link w:val="Subtitle"/>
@@ -3283,7 +3331,7 @@
       <w:color w:val="404040" w:themeColor="text1" w:themeTint="BF"/>
     </w:rPr>
   </w:style>
-  <w:style w:type="character" w:customStyle="1" w:styleId="QuoteChar">
+  <w:style w:type="character" w:styleId="QuoteChar" w:customStyle="1">
     <w:name w:val="Quote Char"/>
     <w:basedOn w:val="DefaultParagraphFont"/>
     <w:link w:val="Quote"/>
@@ -3328,8 +3376,8 @@
     <w:rsid w:val="000D587D"/>
     <w:pPr>
       <w:pBdr>
-        <w:top w:val="single" w:sz="4" w:space="10" w:color="2F5496" w:themeColor="accent1" w:themeShade="BF"/>
-        <w:bottom w:val="single" w:sz="4" w:space="10" w:color="2F5496" w:themeColor="accent1" w:themeShade="BF"/>
+        <w:top w:val="single" w:color="2F5496" w:themeColor="accent1" w:themeShade="BF" w:sz="4" w:space="10"/>
+        <w:bottom w:val="single" w:color="2F5496" w:themeColor="accent1" w:themeShade="BF" w:sz="4" w:space="10"/>
       </w:pBdr>
       <w:spacing w:before="360" w:after="360"/>
       <w:ind w:left="864" w:right="864"/>
@@ -3341,7 +3389,7 @@
       <w:color w:val="2F5496" w:themeColor="accent1" w:themeShade="BF"/>
     </w:rPr>
   </w:style>
-  <w:style w:type="character" w:customStyle="1" w:styleId="IntenseQuoteChar">
+  <w:style w:type="character" w:styleId="IntenseQuoteChar" w:customStyle="1">
     <w:name w:val="Intense Quote Char"/>
     <w:basedOn w:val="DefaultParagraphFont"/>
     <w:link w:val="IntenseQuote"/>
@@ -3377,12 +3425,12 @@
     </w:pPr>
     <w:tblPr>
       <w:tblBorders>
-        <w:top w:val="single" w:sz="4" w:space="0" w:color="auto"/>
-        <w:left w:val="single" w:sz="4" w:space="0" w:color="auto"/>
-        <w:bottom w:val="single" w:sz="4" w:space="0" w:color="auto"/>
-        <w:right w:val="single" w:sz="4" w:space="0" w:color="auto"/>
-        <w:insideH w:val="single" w:sz="4" w:space="0" w:color="auto"/>
-        <w:insideV w:val="single" w:sz="4" w:space="0" w:color="auto"/>
+        <w:top w:val="single" w:color="auto" w:sz="4" w:space="0"/>
+        <w:left w:val="single" w:color="auto" w:sz="4" w:space="0"/>
+        <w:bottom w:val="single" w:color="auto" w:sz="4" w:space="0"/>
+        <w:right w:val="single" w:color="auto" w:sz="4" w:space="0"/>
+        <w:insideH w:val="single" w:color="auto" w:sz="4" w:space="0"/>
+        <w:insideV w:val="single" w:color="auto" w:sz="4" w:space="0"/>
       </w:tblBorders>
     </w:tblPr>
   </w:style>
@@ -3401,7 +3449,7 @@
       <w:spacing w:before="0" w:after="0" w:line="240" w:lineRule="auto"/>
     </w:pPr>
   </w:style>
-  <w:style w:type="character" w:customStyle="1" w:styleId="HeaderChar">
+  <w:style w:type="character" w:styleId="HeaderChar" w:customStyle="1">
     <w:name w:val="Header Char"/>
     <w:basedOn w:val="DefaultParagraphFont"/>
     <w:link w:val="Header"/>
@@ -3423,7 +3471,7 @@
       <w:spacing w:before="0" w:after="0" w:line="240" w:lineRule="auto"/>
     </w:pPr>
   </w:style>
-  <w:style w:type="character" w:customStyle="1" w:styleId="FooterChar">
+  <w:style w:type="character" w:styleId="FooterChar" w:customStyle="1">
     <w:name w:val="Footer Char"/>
     <w:basedOn w:val="DefaultParagraphFont"/>
     <w:link w:val="Footer"/>
@@ -3434,7 +3482,7 @@
 </file>
 
 <file path=word/theme/theme1.xml><?xml version="1.0" encoding="utf-8"?>
-<a:theme xmlns:a="http://schemas.openxmlformats.org/drawingml/2006/main" name="Office Theme">
+<a:theme xmlns:a="http://schemas.openxmlformats.org/drawingml/2006/main" xmlns:thm15="http://schemas.microsoft.com/office/thememl/2012/main" name="Office Theme">
   <a:themeElements>
     <a:clrScheme name="Office">
       <a:dk1>

</xml_diff>